<commit_message>
Agrega Índice y titulo Introducción
</commit_message>
<xml_diff>
--- a/Documentacion/Trabajo Práctico Integrador (T.P.I.) - Sistema de Organizacion de retiros.docx
+++ b/Documentacion/Trabajo Práctico Integrador (T.P.I.) - Sistema de Organizacion de retiros.docx
@@ -212,11 +212,6 @@
         </w:rPr>
         <w:t xml:space="preserve">“SISTEMA DE ORGANIZACIÓN DE RETIROS”</w:t>
       </w:r>
-      <w:r>
-        <w:rPr>
-          <w:rtl w:val="0"/>
-        </w:rPr>
-      </w:r>
     </w:p>
     <w:p>
       <w:pPr>
@@ -474,20 +469,7 @@
         <w:tab/>
         <w:tab/>
         <w:tab/>
-      </w:r>
-      <w:r>
-        <w:rPr>
-          <w:sz w:val="24"/>
-          <w:szCs w:val="24"/>
-          <w:highlight w:val="white"/>
-          <w:rtl w:val="0"/>
-        </w:rPr>
         <w:t xml:space="preserve">OrganiZen</w:t>
-      </w:r>
-      <w:r>
-        <w:rPr>
-          <w:rtl w:val="0"/>
-        </w:rPr>
       </w:r>
     </w:p>
     <w:p>
@@ -548,11 +530,6 @@
         </w:rPr>
         <w:t xml:space="preserve">MAILS:</w:t>
       </w:r>
-      <w:r>
-        <w:rPr>
-          <w:rtl w:val="0"/>
-        </w:rPr>
-      </w:r>
     </w:p>
     <w:p>
       <w:pPr>
@@ -773,11 +750,6 @@
           <w:rtl w:val="0"/>
         </w:rPr>
         <w:t xml:space="preserve">rasinonacho@gmail.com</w:t>
-      </w:r>
-      <w:r>
-        <w:rPr>
-          <w:rtl w:val="0"/>
-        </w:rPr>
       </w:r>
     </w:p>
     <w:p>
@@ -849,11 +821,6 @@
         </w:rPr>
         <w:t xml:space="preserve"> </w:t>
       </w:r>
-      <w:r>
-        <w:rPr>
-          <w:rtl w:val="0"/>
-        </w:rPr>
-      </w:r>
     </w:p>
     <w:p>
       <w:pPr>
@@ -898,55 +865,685 @@
       <w:pPr>
         <w:spacing w:line="240" w:lineRule="auto"/>
         <w:jc w:val="both"/>
+        <w:rPr>
+          <w:sz w:val="24"/>
+          <w:szCs w:val="24"/>
+          <w:highlight w:val="white"/>
+        </w:rPr>
+      </w:pPr>
+      <w:r>
+        <w:rPr>
+          <w:sz w:val="24"/>
+          <w:szCs w:val="24"/>
+          <w:highlight w:val="white"/>
+          <w:rtl w:val="0"/>
+        </w:rPr>
+        <w:t xml:space="preserve">2º (Segundo Año) </w:t>
+      </w:r>
+    </w:p>
+    <w:p>
+      <w:pPr>
+        <w:spacing w:line="240" w:lineRule="auto"/>
+        <w:jc w:val="both"/>
+        <w:rPr>
+          <w:sz w:val="24"/>
+          <w:szCs w:val="24"/>
+          <w:highlight w:val="white"/>
+        </w:rPr>
+      </w:pPr>
+      <w:r>
+        <w:rPr>
+          <w:rtl w:val="0"/>
+        </w:rPr>
+      </w:r>
+    </w:p>
+    <w:p>
+      <w:pPr>
+        <w:spacing w:line="240" w:lineRule="auto"/>
+        <w:jc w:val="both"/>
+        <w:rPr>
+          <w:b w:val="1"/>
+          <w:bCs w:val="1"/>
+          <w:sz w:val="36"/>
+          <w:szCs w:val="36"/>
+        </w:rPr>
+      </w:pPr>
+      <w:r>
+        <w:rPr>
+          <w:b w:val="1"/>
+          <w:bCs w:val="1"/>
+          <w:sz w:val="36"/>
+          <w:szCs w:val="36"/>
+          <w:rtl w:val="0"/>
+        </w:rPr>
+        <w:t xml:space="preserve">Índice </w:t>
+      </w:r>
+    </w:p>
+    <w:sdt>
+      <w:sdtPr>
+        <w:id w:val="743854681"/>
+        <w:docPartObj>
+          <w:docPartGallery w:val="Table of Contents"/>
+          <w:docPartUnique w:val="1"/>
+        </w:docPartObj>
+      </w:sdtPr>
+      <w:sdtContent>
+        <w:p>
+          <w:pPr>
+            <w:widowControl w:val="0"/>
+            <w:tabs>
+              <w:tab w:val="right" w:leader="dot" w:pos="9025.511811023624"/>
+            </w:tabs>
+            <w:spacing w:before="60" w:line="240" w:lineRule="auto"/>
+            <w:rPr>
+              <w:b w:val="1"/>
+              <w:bCs w:val="1"/>
+              <w:color w:val="000000"/>
+              <w:u w:val="none"/>
+            </w:rPr>
+          </w:pPr>
+          <w:r>
+            <w:fldChar w:fldCharType="begin"/>
+            <w:instrText xml:space="preserve"> TOC \h \u \z \t "Heading 1,1,Heading 2,2,Heading 3,3,Heading 4,4,Heading 5,5,Heading 6,6,"</w:instrText>
+            <w:fldChar w:fldCharType="separate"/>
+          </w:r>
+          <w:hyperlink w:anchor="_wiwjxk89py6s">
+            <w:r>
+              <w:rPr>
+                <w:b w:val="1"/>
+                <w:bCs w:val="1"/>
+                <w:color w:val="000000"/>
+                <w:u w:val="none"/>
+                <w:rtl w:val="0"/>
+              </w:rPr>
+              <w:t xml:space="preserve">Introducción</w:t>
+              <w:tab/>
+            </w:r>
+          </w:hyperlink>
+          <w:r>
+            <w:fldChar w:fldCharType="begin"/>
+            <w:instrText xml:space="preserve"> PAGEREF _wiwjxk89py6s \h </w:instrText>
+            <w:fldChar w:fldCharType="separate"/>
+          </w:r>
+          <w:r>
+            <w:rPr>
+              <w:b w:val="1"/>
+              <w:bCs w:val="1"/>
+              <w:rtl w:val="0"/>
+            </w:rPr>
+            <w:t xml:space="preserve">2</w:t>
+          </w:r>
+          <w:r>
+            <w:fldChar w:fldCharType="end"/>
+          </w:r>
+          <w:r>
+            <w:rPr>
+              <w:rtl w:val="0"/>
+            </w:rPr>
+          </w:r>
+          <w:r>
+            <w:fldChar w:fldCharType="end"/>
+          </w:r>
+        </w:p>
+      </w:sdtContent>
+    </w:sdt>
+    <w:p>
+      <w:pPr>
+        <w:spacing w:line="240" w:lineRule="auto"/>
+        <w:jc w:val="both"/>
+        <w:rPr>
+          <w:b w:val="1"/>
+          <w:bCs w:val="1"/>
+          <w:sz w:val="36"/>
+          <w:szCs w:val="36"/>
+        </w:rPr>
+      </w:pPr>
+      <w:r>
+        <w:rPr>
+          <w:rtl w:val="0"/>
+        </w:rPr>
+      </w:r>
+    </w:p>
+    <w:p>
+      <w:pPr>
+        <w:spacing w:line="240" w:lineRule="auto"/>
+        <w:jc w:val="both"/>
+        <w:rPr>
+          <w:b w:val="1"/>
+          <w:bCs w:val="1"/>
+          <w:sz w:val="36"/>
+          <w:szCs w:val="36"/>
+        </w:rPr>
+      </w:pPr>
+      <w:r>
+        <w:rPr>
+          <w:rtl w:val="0"/>
+        </w:rPr>
+      </w:r>
+    </w:p>
+    <w:p>
+      <w:pPr>
+        <w:spacing w:line="240" w:lineRule="auto"/>
+        <w:jc w:val="both"/>
+        <w:rPr>
+          <w:b w:val="1"/>
+          <w:bCs w:val="1"/>
+          <w:sz w:val="36"/>
+          <w:szCs w:val="36"/>
+        </w:rPr>
+      </w:pPr>
+      <w:r>
+        <w:rPr>
+          <w:rtl w:val="0"/>
+        </w:rPr>
+      </w:r>
+    </w:p>
+    <w:p>
+      <w:pPr>
+        <w:spacing w:line="240" w:lineRule="auto"/>
+        <w:jc w:val="both"/>
+        <w:rPr>
+          <w:b w:val="1"/>
+          <w:bCs w:val="1"/>
+          <w:sz w:val="36"/>
+          <w:szCs w:val="36"/>
+        </w:rPr>
+      </w:pPr>
+      <w:r>
+        <w:rPr>
+          <w:rtl w:val="0"/>
+        </w:rPr>
+      </w:r>
+    </w:p>
+    <w:p>
+      <w:pPr>
+        <w:spacing w:line="240" w:lineRule="auto"/>
+        <w:jc w:val="both"/>
+        <w:rPr>
+          <w:b w:val="1"/>
+          <w:bCs w:val="1"/>
+          <w:sz w:val="36"/>
+          <w:szCs w:val="36"/>
+        </w:rPr>
+      </w:pPr>
+      <w:r>
+        <w:rPr>
+          <w:rtl w:val="0"/>
+        </w:rPr>
+      </w:r>
+    </w:p>
+    <w:p>
+      <w:pPr>
+        <w:spacing w:line="240" w:lineRule="auto"/>
+        <w:jc w:val="both"/>
+        <w:rPr>
+          <w:b w:val="1"/>
+          <w:bCs w:val="1"/>
+          <w:sz w:val="36"/>
+          <w:szCs w:val="36"/>
+        </w:rPr>
+      </w:pPr>
+      <w:r>
+        <w:rPr>
+          <w:rtl w:val="0"/>
+        </w:rPr>
+      </w:r>
+    </w:p>
+    <w:p>
+      <w:pPr>
+        <w:spacing w:line="240" w:lineRule="auto"/>
+        <w:jc w:val="both"/>
+        <w:rPr>
+          <w:b w:val="1"/>
+          <w:bCs w:val="1"/>
+          <w:sz w:val="36"/>
+          <w:szCs w:val="36"/>
+        </w:rPr>
+      </w:pPr>
+      <w:r>
+        <w:rPr>
+          <w:rtl w:val="0"/>
+        </w:rPr>
+      </w:r>
+    </w:p>
+    <w:p>
+      <w:pPr>
+        <w:spacing w:line="240" w:lineRule="auto"/>
+        <w:jc w:val="both"/>
+        <w:rPr>
+          <w:b w:val="1"/>
+          <w:bCs w:val="1"/>
+          <w:sz w:val="36"/>
+          <w:szCs w:val="36"/>
+        </w:rPr>
+      </w:pPr>
+      <w:r>
+        <w:rPr>
+          <w:rtl w:val="0"/>
+        </w:rPr>
+      </w:r>
+    </w:p>
+    <w:p>
+      <w:pPr>
+        <w:spacing w:line="240" w:lineRule="auto"/>
+        <w:jc w:val="both"/>
+        <w:rPr>
+          <w:b w:val="1"/>
+          <w:bCs w:val="1"/>
+          <w:sz w:val="36"/>
+          <w:szCs w:val="36"/>
+        </w:rPr>
+      </w:pPr>
+      <w:r>
+        <w:rPr>
+          <w:rtl w:val="0"/>
+        </w:rPr>
+      </w:r>
+    </w:p>
+    <w:p>
+      <w:pPr>
+        <w:spacing w:line="240" w:lineRule="auto"/>
+        <w:jc w:val="both"/>
+        <w:rPr>
+          <w:b w:val="1"/>
+          <w:bCs w:val="1"/>
+          <w:sz w:val="36"/>
+          <w:szCs w:val="36"/>
+        </w:rPr>
+      </w:pPr>
+      <w:r>
+        <w:rPr>
+          <w:rtl w:val="0"/>
+        </w:rPr>
+      </w:r>
+    </w:p>
+    <w:p>
+      <w:pPr>
+        <w:spacing w:line="240" w:lineRule="auto"/>
+        <w:jc w:val="both"/>
+        <w:rPr>
+          <w:b w:val="1"/>
+          <w:bCs w:val="1"/>
+          <w:sz w:val="36"/>
+          <w:szCs w:val="36"/>
+        </w:rPr>
+      </w:pPr>
+      <w:r>
+        <w:rPr>
+          <w:rtl w:val="0"/>
+        </w:rPr>
+      </w:r>
+    </w:p>
+    <w:p>
+      <w:pPr>
+        <w:spacing w:line="240" w:lineRule="auto"/>
+        <w:jc w:val="both"/>
+        <w:rPr>
+          <w:b w:val="1"/>
+          <w:bCs w:val="1"/>
+          <w:sz w:val="36"/>
+          <w:szCs w:val="36"/>
+        </w:rPr>
+      </w:pPr>
+      <w:r>
+        <w:rPr>
+          <w:rtl w:val="0"/>
+        </w:rPr>
+      </w:r>
+    </w:p>
+    <w:p>
+      <w:pPr>
+        <w:spacing w:line="240" w:lineRule="auto"/>
+        <w:jc w:val="both"/>
+        <w:rPr>
+          <w:b w:val="1"/>
+          <w:bCs w:val="1"/>
+          <w:sz w:val="36"/>
+          <w:szCs w:val="36"/>
+        </w:rPr>
+      </w:pPr>
+      <w:r>
+        <w:rPr>
+          <w:rtl w:val="0"/>
+        </w:rPr>
+      </w:r>
+    </w:p>
+    <w:p>
+      <w:pPr>
+        <w:spacing w:line="240" w:lineRule="auto"/>
+        <w:jc w:val="both"/>
+        <w:rPr>
+          <w:b w:val="1"/>
+          <w:bCs w:val="1"/>
+          <w:sz w:val="36"/>
+          <w:szCs w:val="36"/>
+        </w:rPr>
+      </w:pPr>
+      <w:r>
+        <w:rPr>
+          <w:rtl w:val="0"/>
+        </w:rPr>
+      </w:r>
+    </w:p>
+    <w:p>
+      <w:pPr>
+        <w:spacing w:line="240" w:lineRule="auto"/>
+        <w:jc w:val="both"/>
+        <w:rPr>
+          <w:b w:val="1"/>
+          <w:bCs w:val="1"/>
+          <w:sz w:val="36"/>
+          <w:szCs w:val="36"/>
+        </w:rPr>
+      </w:pPr>
+      <w:r>
+        <w:rPr>
+          <w:rtl w:val="0"/>
+        </w:rPr>
+      </w:r>
+    </w:p>
+    <w:p>
+      <w:pPr>
+        <w:spacing w:line="240" w:lineRule="auto"/>
+        <w:jc w:val="both"/>
+        <w:rPr>
+          <w:b w:val="1"/>
+          <w:bCs w:val="1"/>
+          <w:sz w:val="36"/>
+          <w:szCs w:val="36"/>
+        </w:rPr>
+      </w:pPr>
+      <w:r>
+        <w:rPr>
+          <w:rtl w:val="0"/>
+        </w:rPr>
+      </w:r>
+    </w:p>
+    <w:p>
+      <w:pPr>
+        <w:spacing w:line="240" w:lineRule="auto"/>
+        <w:jc w:val="both"/>
+        <w:rPr>
+          <w:b w:val="1"/>
+          <w:bCs w:val="1"/>
+          <w:sz w:val="36"/>
+          <w:szCs w:val="36"/>
+        </w:rPr>
+      </w:pPr>
+      <w:r>
+        <w:rPr>
+          <w:rtl w:val="0"/>
+        </w:rPr>
+      </w:r>
+    </w:p>
+    <w:p>
+      <w:pPr>
+        <w:spacing w:line="240" w:lineRule="auto"/>
+        <w:jc w:val="both"/>
+        <w:rPr>
+          <w:b w:val="1"/>
+          <w:bCs w:val="1"/>
+          <w:sz w:val="36"/>
+          <w:szCs w:val="36"/>
+        </w:rPr>
+      </w:pPr>
+      <w:r>
+        <w:rPr>
+          <w:rtl w:val="0"/>
+        </w:rPr>
+      </w:r>
+    </w:p>
+    <w:p>
+      <w:pPr>
+        <w:spacing w:line="240" w:lineRule="auto"/>
+        <w:jc w:val="both"/>
+        <w:rPr>
+          <w:b w:val="1"/>
+          <w:bCs w:val="1"/>
+          <w:sz w:val="36"/>
+          <w:szCs w:val="36"/>
+        </w:rPr>
+      </w:pPr>
+      <w:r>
+        <w:rPr>
+          <w:rtl w:val="0"/>
+        </w:rPr>
+      </w:r>
+    </w:p>
+    <w:p>
+      <w:pPr>
+        <w:spacing w:line="240" w:lineRule="auto"/>
+        <w:jc w:val="both"/>
+        <w:rPr>
+          <w:b w:val="1"/>
+          <w:bCs w:val="1"/>
+          <w:sz w:val="36"/>
+          <w:szCs w:val="36"/>
+        </w:rPr>
+      </w:pPr>
+      <w:r>
+        <w:rPr>
+          <w:rtl w:val="0"/>
+        </w:rPr>
+      </w:r>
+    </w:p>
+    <w:p>
+      <w:pPr>
+        <w:spacing w:line="240" w:lineRule="auto"/>
+        <w:jc w:val="both"/>
+        <w:rPr>
+          <w:b w:val="1"/>
+          <w:bCs w:val="1"/>
+          <w:sz w:val="36"/>
+          <w:szCs w:val="36"/>
+        </w:rPr>
+      </w:pPr>
+      <w:r>
+        <w:rPr>
+          <w:rtl w:val="0"/>
+        </w:rPr>
+      </w:r>
+    </w:p>
+    <w:p>
+      <w:pPr>
+        <w:spacing w:line="240" w:lineRule="auto"/>
+        <w:jc w:val="both"/>
+        <w:rPr>
+          <w:b w:val="1"/>
+          <w:bCs w:val="1"/>
+          <w:sz w:val="36"/>
+          <w:szCs w:val="36"/>
+        </w:rPr>
+      </w:pPr>
+      <w:r>
+        <w:rPr>
+          <w:rtl w:val="0"/>
+        </w:rPr>
+      </w:r>
+    </w:p>
+    <w:p>
+      <w:pPr>
+        <w:spacing w:line="240" w:lineRule="auto"/>
+        <w:jc w:val="both"/>
+        <w:rPr>
+          <w:b w:val="1"/>
+          <w:bCs w:val="1"/>
+          <w:sz w:val="36"/>
+          <w:szCs w:val="36"/>
+        </w:rPr>
+      </w:pPr>
+      <w:r>
+        <w:rPr>
+          <w:rtl w:val="0"/>
+        </w:rPr>
+      </w:r>
+    </w:p>
+    <w:p>
+      <w:pPr>
+        <w:spacing w:line="240" w:lineRule="auto"/>
+        <w:jc w:val="both"/>
+        <w:rPr>
+          <w:b w:val="1"/>
+          <w:bCs w:val="1"/>
+          <w:sz w:val="36"/>
+          <w:szCs w:val="36"/>
+        </w:rPr>
+      </w:pPr>
+      <w:r>
+        <w:rPr>
+          <w:rtl w:val="0"/>
+        </w:rPr>
+      </w:r>
+    </w:p>
+    <w:p>
+      <w:pPr>
+        <w:spacing w:line="240" w:lineRule="auto"/>
+        <w:jc w:val="both"/>
+        <w:rPr>
+          <w:b w:val="1"/>
+          <w:bCs w:val="1"/>
+          <w:sz w:val="36"/>
+          <w:szCs w:val="36"/>
+        </w:rPr>
+      </w:pPr>
+      <w:r>
+        <w:rPr>
+          <w:rtl w:val="0"/>
+        </w:rPr>
+      </w:r>
+    </w:p>
+    <w:p>
+      <w:pPr>
+        <w:spacing w:line="240" w:lineRule="auto"/>
+        <w:jc w:val="both"/>
+        <w:rPr>
+          <w:b w:val="1"/>
+          <w:bCs w:val="1"/>
+          <w:sz w:val="36"/>
+          <w:szCs w:val="36"/>
+        </w:rPr>
+      </w:pPr>
+      <w:r>
+        <w:rPr>
+          <w:rtl w:val="0"/>
+        </w:rPr>
+      </w:r>
+    </w:p>
+    <w:p>
+      <w:pPr>
+        <w:spacing w:line="240" w:lineRule="auto"/>
+        <w:jc w:val="both"/>
+        <w:rPr>
+          <w:b w:val="1"/>
+          <w:bCs w:val="1"/>
+          <w:sz w:val="36"/>
+          <w:szCs w:val="36"/>
+        </w:rPr>
+      </w:pPr>
+      <w:r>
+        <w:rPr>
+          <w:rtl w:val="0"/>
+        </w:rPr>
+      </w:r>
+    </w:p>
+    <w:p>
+      <w:pPr>
+        <w:spacing w:line="240" w:lineRule="auto"/>
+        <w:jc w:val="both"/>
+        <w:rPr>
+          <w:b w:val="1"/>
+          <w:bCs w:val="1"/>
+          <w:sz w:val="36"/>
+          <w:szCs w:val="36"/>
+        </w:rPr>
+      </w:pPr>
+      <w:r>
+        <w:rPr>
+          <w:rtl w:val="0"/>
+        </w:rPr>
+      </w:r>
+    </w:p>
+    <w:p>
+      <w:pPr>
+        <w:spacing w:line="240" w:lineRule="auto"/>
+        <w:jc w:val="both"/>
+        <w:rPr>
+          <w:b w:val="1"/>
+          <w:bCs w:val="1"/>
+          <w:sz w:val="36"/>
+          <w:szCs w:val="36"/>
+        </w:rPr>
+      </w:pPr>
+      <w:r>
+        <w:rPr>
+          <w:rtl w:val="0"/>
+        </w:rPr>
+      </w:r>
+    </w:p>
+    <w:p>
+      <w:pPr>
+        <w:spacing w:line="240" w:lineRule="auto"/>
+        <w:jc w:val="both"/>
+        <w:rPr>
+          <w:b w:val="1"/>
+          <w:bCs w:val="1"/>
+          <w:sz w:val="36"/>
+          <w:szCs w:val="36"/>
+        </w:rPr>
+      </w:pPr>
+      <w:r>
+        <w:rPr>
+          <w:rtl w:val="0"/>
+        </w:rPr>
+      </w:r>
+    </w:p>
+    <w:p>
+      <w:pPr>
+        <w:pStyle w:val="Heading1"/>
         <w:rPr/>
       </w:pPr>
-      <w:r>
-        <w:rPr>
-          <w:sz w:val="24"/>
-          <w:szCs w:val="24"/>
-          <w:highlight w:val="white"/>
-          <w:rtl w:val="0"/>
-        </w:rPr>
-        <w:t xml:space="preserve">2</w:t>
-      </w:r>
-      <w:r>
-        <w:rPr>
-          <w:sz w:val="24"/>
-          <w:szCs w:val="24"/>
-          <w:highlight w:val="white"/>
-          <w:rtl w:val="0"/>
-        </w:rPr>
-        <w:t xml:space="preserve">º (Segundo Año) </w:t>
-      </w:r>
-      <w:r>
-        <w:rPr>
-          <w:rtl w:val="0"/>
-        </w:rPr>
-      </w:r>
-    </w:p>
-    <w:p>
-      <w:pPr>
-        <w:spacing w:line="240" w:lineRule="auto"/>
-        <w:jc w:val="both"/>
-        <w:rPr>
-          <w:sz w:val="24"/>
-          <w:szCs w:val="24"/>
-        </w:rPr>
-      </w:pPr>
-      <w:r>
-        <w:rPr>
-          <w:rtl w:val="0"/>
-        </w:rPr>
-      </w:r>
-    </w:p>
-    <w:p>
-      <w:pPr>
-        <w:spacing w:line="240" w:lineRule="auto"/>
-        <w:jc w:val="both"/>
-        <w:rPr>
-          <w:sz w:val="24"/>
-          <w:szCs w:val="24"/>
-        </w:rPr>
+      <w:bookmarkStart w:colFirst="0" w:colLast="0" w:name="_wiwjxk89py6s" w:id="0"/>
+      <w:bookmarkEnd w:id="0"/>
+      <w:r>
+        <w:rPr>
+          <w:rtl w:val="0"/>
+        </w:rPr>
+        <w:t xml:space="preserve">Introducción</w:t>
+      </w:r>
+    </w:p>
+    <w:p>
+      <w:pPr>
+        <w:rPr/>
+      </w:pPr>
+      <w:r>
+        <w:rPr>
+          <w:rtl w:val="0"/>
+        </w:rPr>
+      </w:r>
+    </w:p>
+    <w:p>
+      <w:pPr>
+        <w:rPr/>
+      </w:pPr>
+      <w:r>
+        <w:rPr>
+          <w:rtl w:val="0"/>
+        </w:rPr>
+      </w:r>
+    </w:p>
+    <w:p>
+      <w:pPr>
+        <w:rPr/>
+      </w:pPr>
+      <w:r>
+        <w:rPr>
+          <w:rtl w:val="0"/>
+        </w:rPr>
+      </w:r>
+    </w:p>
+    <w:p>
+      <w:pPr>
+        <w:rPr/>
       </w:pPr>
       <w:r>
         <w:rPr>
@@ -1249,23 +1846,6 @@
 </file>
 
 <file path=word/footer1.xml><?xml version="1.0" encoding="utf-8"?>
-<w:ftr xmlns:mc="http://schemas.openxmlformats.org/markup-compatibility/2006" xmlns:o="urn:schemas-microsoft-com:office:office" xmlns:r="http://schemas.openxmlformats.org/officeDocument/2006/relationships" xmlns:m="http://schemas.openxmlformats.org/officeDocument/2006/math" xmlns:v="urn:schemas-microsoft-com:vml" xmlns:wp="http://schemas.openxmlformats.org/drawingml/2006/wordprocessingDrawing" xmlns:w10="urn:schemas-microsoft-com:office:word" xmlns:w="http://schemas.openxmlformats.org/wordprocessingml/2006/main" xmlns:wne="http://schemas.microsoft.com/office/word/2006/wordml" xmlns:sl="http://schemas.openxmlformats.org/schemaLibrary/2006/main" xmlns:a="http://schemas.openxmlformats.org/drawingml/2006/main" xmlns:pic="http://schemas.openxmlformats.org/drawingml/2006/picture" xmlns:c="http://schemas.openxmlformats.org/drawingml/2006/chart" xmlns:lc="http://schemas.openxmlformats.org/drawingml/2006/lockedCanvas" xmlns:dgm="http://schemas.openxmlformats.org/drawingml/2006/diagram" xmlns:wps="http://schemas.microsoft.com/office/word/2010/wordprocessingShape" xmlns:wpg="http://schemas.microsoft.com/office/word/2010/wordprocessingGroup" xmlns:w14="http://schemas.microsoft.com/office/word/2010/wordml" xmlns:w15="http://schemas.microsoft.com/office/word/2012/wordml" xmlns:w16="http://schemas.microsoft.com/office/word/2018/wordml" xmlns:w16cex="http://schemas.microsoft.com/office/word/2018/wordml/cex" xmlns:w16cid="http://schemas.microsoft.com/office/word/2016/wordml/cid" xmlns="http://schemas.microsoft.com/office/tasks/2019/documenttasks" xmlns:cr="http://schemas.microsoft.com/office/comments/2020/reactions">
-  <w:p>
-    <w:pPr>
-      <w:ind w:left="7920" w:firstLine="720"/>
-      <w:rPr/>
-    </w:pPr>
-    <w:r>
-      <w:rPr>
-        <w:rtl w:val="0"/>
-      </w:rPr>
-      <w:t xml:space="preserve">    1</w:t>
-    </w:r>
-  </w:p>
-</w:ftr>
-</file>
-
-<file path=word/footer2.xml><?xml version="1.0" encoding="utf-8"?>
 <w:ftr xmlns:mc="http://schemas.openxmlformats.org/markup-compatibility/2006" xmlns:o="urn:schemas-microsoft-com:office:office" xmlns:r="http://schemas.openxmlformats.org/officeDocument/2006/relationships" xmlns:m="http://schemas.openxmlformats.org/officeDocument/2006/math" xmlns:v="urn:schemas-microsoft-com:vml" xmlns:wp="http://schemas.openxmlformats.org/drawingml/2006/wordprocessingDrawing" xmlns:w10="urn:schemas-microsoft-com:office:word" xmlns:w="http://schemas.openxmlformats.org/wordprocessingml/2006/main" xmlns:wne="http://schemas.microsoft.com/office/word/2006/wordml" xmlns:sl="http://schemas.openxmlformats.org/schemaLibrary/2006/main" xmlns:a="http://schemas.openxmlformats.org/drawingml/2006/main" xmlns:pic="http://schemas.openxmlformats.org/drawingml/2006/picture" xmlns:c="http://schemas.openxmlformats.org/drawingml/2006/chart" xmlns:lc="http://schemas.openxmlformats.org/drawingml/2006/lockedCanvas" xmlns:dgm="http://schemas.openxmlformats.org/drawingml/2006/diagram" xmlns:wps="http://schemas.microsoft.com/office/word/2010/wordprocessingShape" xmlns:wpg="http://schemas.microsoft.com/office/word/2010/wordprocessingGroup" xmlns:w14="http://schemas.microsoft.com/office/word/2010/wordml" xmlns:w15="http://schemas.microsoft.com/office/word/2012/wordml" xmlns:w16="http://schemas.microsoft.com/office/word/2018/wordml" xmlns:w16cex="http://schemas.microsoft.com/office/word/2018/wordml/cex" xmlns:w16cid="http://schemas.microsoft.com/office/word/2016/wordml/cid" xmlns="http://schemas.microsoft.com/office/tasks/2019/documenttasks" xmlns:cr="http://schemas.microsoft.com/office/comments/2020/reactions">
   <w:p>
     <w:pPr>
@@ -1294,6 +1874,23 @@
       <w:rPr>
         <w:rtl w:val="0"/>
       </w:rPr>
+    </w:r>
+  </w:p>
+</w:ftr>
+</file>
+
+<file path=word/footer2.xml><?xml version="1.0" encoding="utf-8"?>
+<w:ftr xmlns:mc="http://schemas.openxmlformats.org/markup-compatibility/2006" xmlns:o="urn:schemas-microsoft-com:office:office" xmlns:r="http://schemas.openxmlformats.org/officeDocument/2006/relationships" xmlns:m="http://schemas.openxmlformats.org/officeDocument/2006/math" xmlns:v="urn:schemas-microsoft-com:vml" xmlns:wp="http://schemas.openxmlformats.org/drawingml/2006/wordprocessingDrawing" xmlns:w10="urn:schemas-microsoft-com:office:word" xmlns:w="http://schemas.openxmlformats.org/wordprocessingml/2006/main" xmlns:wne="http://schemas.microsoft.com/office/word/2006/wordml" xmlns:sl="http://schemas.openxmlformats.org/schemaLibrary/2006/main" xmlns:a="http://schemas.openxmlformats.org/drawingml/2006/main" xmlns:pic="http://schemas.openxmlformats.org/drawingml/2006/picture" xmlns:c="http://schemas.openxmlformats.org/drawingml/2006/chart" xmlns:lc="http://schemas.openxmlformats.org/drawingml/2006/lockedCanvas" xmlns:dgm="http://schemas.openxmlformats.org/drawingml/2006/diagram" xmlns:wps="http://schemas.microsoft.com/office/word/2010/wordprocessingShape" xmlns:wpg="http://schemas.microsoft.com/office/word/2010/wordprocessingGroup" xmlns:w14="http://schemas.microsoft.com/office/word/2010/wordml" xmlns:w15="http://schemas.microsoft.com/office/word/2012/wordml" xmlns:w16="http://schemas.microsoft.com/office/word/2018/wordml" xmlns:w16cex="http://schemas.microsoft.com/office/word/2018/wordml/cex" xmlns:w16cid="http://schemas.microsoft.com/office/word/2016/wordml/cid" xmlns="http://schemas.microsoft.com/office/tasks/2019/documenttasks" xmlns:cr="http://schemas.microsoft.com/office/comments/2020/reactions">
+  <w:p>
+    <w:pPr>
+      <w:ind w:left="7920" w:firstLine="720"/>
+      <w:rPr/>
+    </w:pPr>
+    <w:r>
+      <w:rPr>
+        <w:rtl w:val="0"/>
+      </w:rPr>
+      <w:t xml:space="preserve">    1</w:t>
     </w:r>
   </w:p>
 </w:ftr>

</xml_diff>

<commit_message>
Agrega parte del Anexo
</commit_message>
<xml_diff>
--- a/Documentacion/Trabajo Práctico Integrador (T.P.I.) - Sistema de Organizacion de retiros.docx
+++ b/Documentacion/Trabajo Práctico Integrador (T.P.I.) - Sistema de Organizacion de retiros.docx
@@ -24,7 +24,7 @@
           <wp:inline distB="114300" distT="114300" distL="114300" distR="114300">
             <wp:extent cx="4826000" cy="965200"/>
             <wp:effectExtent b="0" l="0" r="0" t="0"/>
-            <wp:docPr id="1" name="image1.png"/>
+            <wp:docPr id="3" name="image1.png"/>
             <a:graphic>
               <a:graphicData uri="http://schemas.openxmlformats.org/drawingml/2006/picture">
                 <pic:pic>
@@ -921,7 +921,7 @@
     </w:p>
     <w:sdt>
       <w:sdtPr>
-        <w:id w:val="214986786"/>
+        <w:id w:val="1768294554"/>
         <w:docPartObj>
           <w:docPartGallery w:val="Table of Contents"/>
           <w:docPartUnique w:val="1"/>
@@ -947,7 +947,7 @@
             <w:instrText xml:space="preserve"> TOC \h \u \z \t "Heading 1,1,Heading 2,2,Heading 3,3,Heading 4,4,Heading 5,5,Heading 6,6,"</w:instrText>
             <w:fldChar w:fldCharType="separate"/>
           </w:r>
-          <w:hyperlink w:anchor="_ueykryczz2ru">
+          <w:hyperlink w:anchor="_krnxqbcdsmf1">
             <w:r>
               <w:rPr>
                 <w:b w:val="1"/>
@@ -962,7 +962,7 @@
           </w:hyperlink>
           <w:r>
             <w:fldChar w:fldCharType="begin"/>
-            <w:instrText xml:space="preserve"> PAGEREF _ueykryczz2ru \h </w:instrText>
+            <w:instrText xml:space="preserve"> PAGEREF _krnxqbcdsmf1 \h </w:instrText>
             <w:fldChar w:fldCharType="separate"/>
           </w:r>
           <w:r>
@@ -1502,7 +1502,7 @@
         <w:pStyle w:val="Heading1"/>
         <w:rPr/>
       </w:pPr>
-      <w:bookmarkStart w:colFirst="0" w:colLast="0" w:name="_ueykryczz2ru" w:id="0"/>
+      <w:bookmarkStart w:colFirst="0" w:colLast="0" w:name="_krnxqbcdsmf1" w:id="0"/>
       <w:bookmarkEnd w:id="0"/>
       <w:r>
         <w:rPr>
@@ -1549,7 +1549,7 @@
         <w:pStyle w:val="Heading1"/>
         <w:rPr/>
       </w:pPr>
-      <w:bookmarkStart w:colFirst="0" w:colLast="0" w:name="_4zdhqfugnnis" w:id="1"/>
+      <w:bookmarkStart w:colFirst="0" w:colLast="0" w:name="_iqjymjmpd57m" w:id="1"/>
       <w:bookmarkEnd w:id="1"/>
       <w:r>
         <w:rPr>
@@ -1569,7 +1569,7 @@
           <wp:inline distB="114300" distT="114300" distL="114300" distR="114300">
             <wp:extent cx="1843088" cy="1834097"/>
             <wp:effectExtent b="0" l="0" r="0" t="0"/>
-            <wp:docPr id="2" name="image2.png"/>
+            <wp:docPr id="5" name="image2.png"/>
             <a:graphic>
               <a:graphicData uri="http://schemas.openxmlformats.org/drawingml/2006/picture">
                 <pic:pic>
@@ -1821,7 +1821,7 @@
           <w:u w:val="single"/>
         </w:rPr>
       </w:pPr>
-      <w:bookmarkStart w:colFirst="0" w:colLast="0" w:name="_ga0ql4g1vcy2" w:id="2"/>
+      <w:bookmarkStart w:colFirst="0" w:colLast="0" w:name="_efexn0s32erj" w:id="2"/>
       <w:bookmarkEnd w:id="2"/>
       <w:r>
         <w:rPr>
@@ -2265,7 +2265,7 @@
           <w:szCs w:val="48"/>
         </w:rPr>
       </w:pPr>
-      <w:bookmarkStart w:colFirst="0" w:colLast="0" w:name="_bxtm37qwum26" w:id="3"/>
+      <w:bookmarkStart w:colFirst="0" w:colLast="0" w:name="_klbwwniu741p" w:id="3"/>
       <w:bookmarkEnd w:id="3"/>
       <w:r>
         <w:rPr>
@@ -3001,11 +3001,424 @@
         </w:rPr>
       </w:r>
     </w:p>
+    <w:p>
+      <w:pPr>
+        <w:rPr/>
+      </w:pPr>
+      <w:r>
+        <w:rPr>
+          <w:rtl w:val="0"/>
+        </w:rPr>
+      </w:r>
+    </w:p>
+    <w:p>
+      <w:pPr>
+        <w:rPr/>
+      </w:pPr>
+      <w:r>
+        <w:rPr>
+          <w:rtl w:val="0"/>
+        </w:rPr>
+      </w:r>
+    </w:p>
+    <w:p>
+      <w:pPr>
+        <w:rPr/>
+      </w:pPr>
+      <w:r>
+        <w:rPr>
+          <w:rtl w:val="0"/>
+        </w:rPr>
+      </w:r>
+    </w:p>
+    <w:p>
+      <w:pPr>
+        <w:pStyle w:val="Heading1"/>
+        <w:rPr/>
+      </w:pPr>
+      <w:bookmarkStart w:colFirst="0" w:colLast="0" w:name="_wecvj7jmow2o" w:id="4"/>
+      <w:bookmarkEnd w:id="4"/>
+      <w:r>
+        <w:rPr>
+          <w:rtl w:val="0"/>
+        </w:rPr>
+        <w:t xml:space="preserve">Anexo</w:t>
+      </w:r>
+    </w:p>
+    <w:p>
+      <w:pPr>
+        <w:rPr/>
+      </w:pPr>
+      <w:r>
+        <w:rPr>
+          <w:rtl w:val="0"/>
+        </w:rPr>
+      </w:r>
+    </w:p>
+    <w:p>
+      <w:pPr>
+        <w:spacing w:line="276" w:lineRule="auto"/>
+        <w:rPr/>
+      </w:pPr>
+      <w:r>
+        <w:rPr>
+          <w:b w:val="1"/>
+          <w:bCs w:val="1"/>
+          <w:i w:val="1"/>
+          <w:iCs w:val="1"/>
+          <w:u w:val="single"/>
+          <w:rtl w:val="0"/>
+        </w:rPr>
+        <w:t xml:space="preserve">Respuesta del retiro solar:</w:t>
+      </w:r>
+      <w:r>
+        <w:rPr>
+          <w:rtl w:val="0"/>
+        </w:rPr>
+      </w:r>
+    </w:p>
+    <w:p>
+      <w:pPr>
+        <w:spacing w:line="276" w:lineRule="auto"/>
+        <w:rPr/>
+      </w:pPr>
+      <w:r>
+        <w:rPr>
+          <w:rtl w:val="0"/>
+        </w:rPr>
+      </w:r>
+    </w:p>
+    <w:p>
+      <w:pPr>
+        <w:spacing w:line="276" w:lineRule="auto"/>
+        <w:rPr/>
+      </w:pPr>
+      <w:r>
+        <w:rPr/>
+        <w:drawing>
+          <wp:inline distB="114300" distT="114300" distL="114300" distR="114300">
+            <wp:extent cx="2881313" cy="5657850"/>
+            <wp:effectExtent b="0" l="0" r="0" t="0"/>
+            <wp:docPr id="6" name="image3.png"/>
+            <a:graphic>
+              <a:graphicData uri="http://schemas.openxmlformats.org/drawingml/2006/picture">
+                <pic:pic>
+                  <pic:nvPicPr>
+                    <pic:cNvPr id="0" name="image3.png"/>
+                    <pic:cNvPicPr preferRelativeResize="0"/>
+                  </pic:nvPicPr>
+                  <pic:blipFill>
+                    <a:blip r:embed="rId8"/>
+                    <a:srcRect b="0" l="0" r="0" t="0"/>
+                    <a:stretch>
+                      <a:fillRect/>
+                    </a:stretch>
+                  </pic:blipFill>
+                  <pic:spPr>
+                    <a:xfrm>
+                      <a:off x="0" y="0"/>
+                      <a:ext cx="2881313" cy="5657850"/>
+                    </a:xfrm>
+                    <a:prstGeom prst="rect"/>
+                    <a:ln/>
+                  </pic:spPr>
+                </pic:pic>
+              </a:graphicData>
+            </a:graphic>
+          </wp:inline>
+        </w:drawing>
+      </w:r>
+      <w:r>
+        <w:rPr>
+          <w:rtl w:val="0"/>
+        </w:rPr>
+      </w:r>
+    </w:p>
+    <w:p>
+      <w:pPr>
+        <w:spacing w:line="276" w:lineRule="auto"/>
+        <w:rPr/>
+      </w:pPr>
+      <w:r>
+        <w:rPr>
+          <w:rtl w:val="0"/>
+        </w:rPr>
+      </w:r>
+    </w:p>
+    <w:p>
+      <w:pPr>
+        <w:spacing w:line="276" w:lineRule="auto"/>
+        <w:rPr/>
+      </w:pPr>
+      <w:hyperlink r:id="rId9">
+        <w:r>
+          <w:rPr>
+            <w:color w:val="1155cc"/>
+            <w:u w:val="single"/>
+            <w:rtl w:val="0"/>
+          </w:rPr>
+          <w:t xml:space="preserve">https://drive.google.com/file/d/1DLDrn_C3XYR554_LCSC6Q-9L7J_NxBEs/view</w:t>
+        </w:r>
+      </w:hyperlink>
+      <w:r>
+        <w:rPr>
+          <w:rtl w:val="0"/>
+        </w:rPr>
+      </w:r>
+    </w:p>
+    <w:p>
+      <w:pPr>
+        <w:spacing w:line="276" w:lineRule="auto"/>
+        <w:rPr/>
+      </w:pPr>
+      <w:r>
+        <w:rPr>
+          <w:rtl w:val="0"/>
+        </w:rPr>
+      </w:r>
+    </w:p>
+    <w:p>
+      <w:pPr>
+        <w:spacing w:line="276" w:lineRule="auto"/>
+        <w:rPr/>
+      </w:pPr>
+      <w:r>
+        <w:rPr>
+          <w:rtl w:val="0"/>
+        </w:rPr>
+      </w:r>
+    </w:p>
+    <w:p>
+      <w:pPr>
+        <w:spacing w:line="276" w:lineRule="auto"/>
+        <w:rPr/>
+      </w:pPr>
+      <w:r>
+        <w:rPr>
+          <w:rtl w:val="0"/>
+        </w:rPr>
+      </w:r>
+    </w:p>
+    <w:p>
+      <w:pPr>
+        <w:spacing w:line="276" w:lineRule="auto"/>
+        <w:rPr/>
+      </w:pPr>
+      <w:r>
+        <w:rPr>
+          <w:rtl w:val="0"/>
+        </w:rPr>
+      </w:r>
+    </w:p>
+    <w:p>
+      <w:pPr>
+        <w:spacing w:line="276" w:lineRule="auto"/>
+        <w:rPr/>
+      </w:pPr>
+      <w:r>
+        <w:rPr>
+          <w:rtl w:val="0"/>
+        </w:rPr>
+      </w:r>
+    </w:p>
+    <w:p>
+      <w:pPr>
+        <w:spacing w:line="276" w:lineRule="auto"/>
+        <w:rPr/>
+      </w:pPr>
+      <w:r>
+        <w:rPr>
+          <w:rtl w:val="0"/>
+        </w:rPr>
+      </w:r>
+    </w:p>
+    <w:p>
+      <w:pPr>
+        <w:spacing w:line="276" w:lineRule="auto"/>
+        <w:rPr/>
+      </w:pPr>
+      <w:r>
+        <w:rPr>
+          <w:rtl w:val="0"/>
+        </w:rPr>
+      </w:r>
+    </w:p>
+    <w:p>
+      <w:pPr>
+        <w:spacing w:line="276" w:lineRule="auto"/>
+        <w:rPr/>
+      </w:pPr>
+      <w:r>
+        <w:rPr>
+          <w:rtl w:val="0"/>
+        </w:rPr>
+      </w:r>
+    </w:p>
+    <w:p>
+      <w:pPr>
+        <w:spacing w:line="276" w:lineRule="auto"/>
+        <w:rPr/>
+      </w:pPr>
+      <w:r>
+        <w:rPr>
+          <w:rtl w:val="0"/>
+        </w:rPr>
+        <w:t xml:space="preserve">algunas de las imágenes de retiro solar:</w:t>
+      </w:r>
+    </w:p>
+    <w:p>
+      <w:pPr>
+        <w:spacing w:line="276" w:lineRule="auto"/>
+        <w:rPr/>
+      </w:pPr>
+      <w:r>
+        <w:rPr/>
+        <w:drawing>
+          <wp:inline distB="114300" distT="114300" distL="114300" distR="114300">
+            <wp:extent cx="2405063" cy="1701632"/>
+            <wp:effectExtent b="0" l="0" r="0" t="0"/>
+            <wp:docPr id="4" name="image4.png"/>
+            <a:graphic>
+              <a:graphicData uri="http://schemas.openxmlformats.org/drawingml/2006/picture">
+                <pic:pic>
+                  <pic:nvPicPr>
+                    <pic:cNvPr id="0" name="image4.png"/>
+                    <pic:cNvPicPr preferRelativeResize="0"/>
+                  </pic:nvPicPr>
+                  <pic:blipFill>
+                    <a:blip r:embed="rId10"/>
+                    <a:srcRect b="0" l="0" r="0" t="0"/>
+                    <a:stretch>
+                      <a:fillRect/>
+                    </a:stretch>
+                  </pic:blipFill>
+                  <pic:spPr>
+                    <a:xfrm>
+                      <a:off x="0" y="0"/>
+                      <a:ext cx="2405063" cy="1701632"/>
+                    </a:xfrm>
+                    <a:prstGeom prst="rect"/>
+                    <a:ln/>
+                  </pic:spPr>
+                </pic:pic>
+              </a:graphicData>
+            </a:graphic>
+          </wp:inline>
+        </w:drawing>
+      </w:r>
+      <w:r>
+        <w:rPr/>
+        <w:drawing>
+          <wp:inline distB="114300" distT="114300" distL="114300" distR="114300">
+            <wp:extent cx="2237295" cy="1709724"/>
+            <wp:effectExtent b="0" l="0" r="0" t="0"/>
+            <wp:docPr id="1" name="image6.png"/>
+            <a:graphic>
+              <a:graphicData uri="http://schemas.openxmlformats.org/drawingml/2006/picture">
+                <pic:pic>
+                  <pic:nvPicPr>
+                    <pic:cNvPr id="0" name="image6.png"/>
+                    <pic:cNvPicPr preferRelativeResize="0"/>
+                  </pic:nvPicPr>
+                  <pic:blipFill>
+                    <a:blip r:embed="rId11"/>
+                    <a:srcRect b="0" l="0" r="0" t="0"/>
+                    <a:stretch>
+                      <a:fillRect/>
+                    </a:stretch>
+                  </pic:blipFill>
+                  <pic:spPr>
+                    <a:xfrm>
+                      <a:off x="0" y="0"/>
+                      <a:ext cx="2237295" cy="1709724"/>
+                    </a:xfrm>
+                    <a:prstGeom prst="rect"/>
+                    <a:ln/>
+                  </pic:spPr>
+                </pic:pic>
+              </a:graphicData>
+            </a:graphic>
+          </wp:inline>
+        </w:drawing>
+      </w:r>
+      <w:r>
+        <w:rPr>
+          <w:rtl w:val="0"/>
+        </w:rPr>
+      </w:r>
+    </w:p>
+    <w:p>
+      <w:pPr>
+        <w:spacing w:line="276" w:lineRule="auto"/>
+        <w:rPr/>
+      </w:pPr>
+      <w:r>
+        <w:rPr>
+          <w:rtl w:val="0"/>
+        </w:rPr>
+      </w:r>
+    </w:p>
+    <w:p>
+      <w:pPr>
+        <w:spacing w:line="276" w:lineRule="auto"/>
+        <w:rPr/>
+      </w:pPr>
+      <w:r>
+        <w:rPr/>
+        <w:drawing>
+          <wp:inline distB="114300" distT="114300" distL="114300" distR="114300">
+            <wp:extent cx="3681413" cy="1519313"/>
+            <wp:effectExtent b="0" l="0" r="0" t="0"/>
+            <wp:docPr id="2" name="image5.png"/>
+            <a:graphic>
+              <a:graphicData uri="http://schemas.openxmlformats.org/drawingml/2006/picture">
+                <pic:pic>
+                  <pic:nvPicPr>
+                    <pic:cNvPr id="0" name="image5.png"/>
+                    <pic:cNvPicPr preferRelativeResize="0"/>
+                  </pic:nvPicPr>
+                  <pic:blipFill>
+                    <a:blip r:embed="rId12"/>
+                    <a:srcRect b="0" l="0" r="0" t="0"/>
+                    <a:stretch>
+                      <a:fillRect/>
+                    </a:stretch>
+                  </pic:blipFill>
+                  <pic:spPr>
+                    <a:xfrm>
+                      <a:off x="0" y="0"/>
+                      <a:ext cx="3681413" cy="1519313"/>
+                    </a:xfrm>
+                    <a:prstGeom prst="rect"/>
+                    <a:ln/>
+                  </pic:spPr>
+                </pic:pic>
+              </a:graphicData>
+            </a:graphic>
+          </wp:inline>
+        </w:drawing>
+      </w:r>
+      <w:r>
+        <w:rPr>
+          <w:rtl w:val="0"/>
+        </w:rPr>
+      </w:r>
+    </w:p>
+    <w:p>
+      <w:pPr>
+        <w:rPr/>
+      </w:pPr>
+      <w:r>
+        <w:rPr>
+          <w:rtl w:val="0"/>
+        </w:rPr>
+      </w:r>
+    </w:p>
     <w:sectPr>
-      <w:headerReference r:id="rId8" w:type="default"/>
-      <w:headerReference r:id="rId9" w:type="first"/>
-      <w:footerReference r:id="rId10" w:type="default"/>
-      <w:footerReference r:id="rId11" w:type="first"/>
+      <w:headerReference r:id="rId13" w:type="default"/>
+      <w:headerReference r:id="rId14" w:type="first"/>
+      <w:footerReference r:id="rId15" w:type="default"/>
+      <w:footerReference r:id="rId16" w:type="first"/>
       <w:pgSz w:h="16834" w:w="11909" w:orient="portrait"/>
       <w:pgMar w:bottom="1440" w:top="1440" w:left="1440" w:right="1440" w:header="720" w:footer="720"/>
       <w:pgNumType w:start="1"/>

</xml_diff>